<commit_message>
Extended Vue description + Vue bibliography
</commit_message>
<xml_diff>
--- a/docs/collection/Szakirodalom.docx
+++ b/docs/collection/Szakirodalom.docx
@@ -634,12 +634,351 @@
         <w:jc w:val="left"/>
         <w:rPr/>
       </w:pPr>
+      <w:r>
+        <w:rPr>
+          <w:rStyle w:val="InternetLink"/>
+        </w:rPr>
+        <w:t>https://www.academia.edu/download/100125690/195413434.pdf</w:t>
+      </w:r>
+    </w:p>
+    <w:p>
+      <w:pPr>
+        <w:pStyle w:val="Normal"/>
+        <w:bidi w:val="0"/>
+        <w:jc w:val="left"/>
+        <w:rPr>
+          <w:rStyle w:val="InternetLink"/>
+        </w:rPr>
+      </w:pPr>
+      <w:r>
+        <w:rPr/>
+      </w:r>
+    </w:p>
+    <w:p>
+      <w:pPr>
+        <w:pStyle w:val="Normal"/>
+        <w:bidi w:val="0"/>
+        <w:rPr/>
+      </w:pPr>
+      <w:r>
+        <w:rPr>
+          <w:rStyle w:val="InternetLink"/>
+          <w:b/>
+          <w:bCs/>
+          <w:color w:val="auto"/>
+          <w:u w:val="none"/>
+        </w:rPr>
+        <w:t xml:space="preserve">Nagy, S., &amp; Nagy, Z. (2021). Okos közlekedési fejlesztés a miskolci autóbusz menetrend példáján keresztül. </w:t>
+      </w:r>
+      <w:r>
+        <w:rPr>
+          <w:rStyle w:val="InternetLink"/>
+          <w:b/>
+          <w:bCs/>
+          <w:i/>
+          <w:color w:val="auto"/>
+          <w:u w:val="none"/>
+        </w:rPr>
+        <w:t>ÉSZAK-MAGYARORSZÁGI STRATÉGIAI FÜZETEK</w:t>
+      </w:r>
+      <w:r>
+        <w:rPr>
+          <w:rStyle w:val="InternetLink"/>
+          <w:b/>
+          <w:bCs/>
+          <w:color w:val="auto"/>
+          <w:u w:val="none"/>
+        </w:rPr>
+        <w:t xml:space="preserve">, </w:t>
+      </w:r>
+      <w:r>
+        <w:rPr>
+          <w:rStyle w:val="InternetLink"/>
+          <w:b/>
+          <w:bCs/>
+          <w:i/>
+          <w:color w:val="auto"/>
+          <w:u w:val="none"/>
+        </w:rPr>
+        <w:t>18</w:t>
+      </w:r>
+      <w:r>
+        <w:rPr>
+          <w:rStyle w:val="InternetLink"/>
+          <w:b/>
+          <w:bCs/>
+          <w:color w:val="auto"/>
+          <w:u w:val="none"/>
+        </w:rPr>
+        <w:t>(Klnsz), 105-115.</w:t>
+      </w:r>
+    </w:p>
+    <w:p>
+      <w:pPr>
+        <w:pStyle w:val="Normal"/>
+        <w:bidi w:val="0"/>
+        <w:rPr/>
+      </w:pPr>
+      <w:r>
+        <w:rPr>
+          <w:rStyle w:val="InternetLink"/>
+          <w:color w:val="000080"/>
+          <w:u w:val="single"/>
+        </w:rPr>
+        <w:t>https://real.mtak.hu/125057/1/SF-2021-k_105_NagyStella_NagyZ.pdf</w:t>
+      </w:r>
+    </w:p>
+    <w:p>
+      <w:pPr>
+        <w:pStyle w:val="Normal"/>
+        <w:bidi w:val="0"/>
+        <w:rPr>
+          <w:rStyle w:val="InternetLink"/>
+          <w:color w:val="auto"/>
+          <w:u w:val="none"/>
+        </w:rPr>
+      </w:pPr>
+      <w:r>
+        <w:rPr>
+          <w:color w:val="auto"/>
+          <w:u w:val="none"/>
+        </w:rPr>
+      </w:r>
+    </w:p>
+    <w:p>
+      <w:pPr>
+        <w:pStyle w:val="Normal"/>
+        <w:bidi w:val="0"/>
+        <w:rPr/>
+      </w:pPr>
+      <w:r>
+        <w:rPr>
+          <w:rStyle w:val="InternetLink"/>
+          <w:b/>
+          <w:bCs/>
+          <w:color w:val="auto"/>
+          <w:u w:val="none"/>
+        </w:rPr>
+        <w:t>György, S. (2014). Konnektivitás a közösségi közlekedésben: Connected Bus.</w:t>
+      </w:r>
+    </w:p>
+    <w:p>
+      <w:pPr>
+        <w:pStyle w:val="Normal"/>
+        <w:bidi w:val="0"/>
+        <w:jc w:val="left"/>
+        <w:rPr/>
+      </w:pPr>
+      <w:r>
+        <w:rPr>
+          <w:rStyle w:val="InternetLink"/>
+        </w:rPr>
+        <w:t>https://mmaws.bme.hu/2014/pages/program/papers/11.pdf</w:t>
+      </w:r>
+    </w:p>
+    <w:p>
+      <w:pPr>
+        <w:pStyle w:val="Normal"/>
+        <w:bidi w:val="0"/>
+        <w:jc w:val="left"/>
+        <w:rPr/>
+      </w:pPr>
+      <w:r>
+        <w:rPr/>
+      </w:r>
+    </w:p>
+    <w:p>
+      <w:pPr>
+        <w:pStyle w:val="Normal"/>
+        <w:bidi w:val="0"/>
+        <w:jc w:val="left"/>
+        <w:rPr>
+          <w:b/>
+          <w:b/>
+          <w:bCs/>
+        </w:rPr>
+      </w:pPr>
+      <w:r>
+        <w:rPr>
+          <w:b/>
+          <w:bCs/>
+        </w:rPr>
+        <w:t xml:space="preserve">Zungeru, A. M., Maidawa, K. D., Ambafi, J. G., &amp; Omokhafe, J. T. (2012). Design and Implementation of a Low Cost Digital Bus Passenger Counter. </w:t>
+      </w:r>
+      <w:r>
+        <w:rPr>
+          <w:b/>
+          <w:bCs/>
+          <w:i/>
+        </w:rPr>
+        <w:t>Innovative Systems Design and Engineering</w:t>
+      </w:r>
+      <w:r>
+        <w:rPr>
+          <w:b/>
+          <w:bCs/>
+        </w:rPr>
+        <w:t xml:space="preserve">, </w:t>
+      </w:r>
+      <w:r>
+        <w:rPr>
+          <w:b/>
+          <w:bCs/>
+          <w:i/>
+        </w:rPr>
+        <w:t>3</w:t>
+      </w:r>
+      <w:r>
+        <w:rPr>
+          <w:b/>
+          <w:bCs/>
+        </w:rPr>
+        <w:t>(4), 29-41.</w:t>
+      </w:r>
+    </w:p>
+    <w:p>
+      <w:pPr>
+        <w:pStyle w:val="Normal"/>
+        <w:bidi w:val="0"/>
+        <w:jc w:val="left"/>
+        <w:rPr/>
+      </w:pPr>
+      <w:r>
+        <w:rPr>
+          <w:rStyle w:val="InternetLink"/>
+        </w:rPr>
+        <w:t>https://citeseerx.ist.psu.edu/document?repid=rep1&amp;type=pdf&amp;doi=cf3859762ef5c8f6850411a0d14f2e64e70a190f</w:t>
+      </w:r>
+    </w:p>
+    <w:p>
+      <w:pPr>
+        <w:pStyle w:val="Normal"/>
+        <w:bidi w:val="0"/>
+        <w:jc w:val="left"/>
+        <w:rPr/>
+      </w:pPr>
+      <w:r>
+        <w:rPr/>
+      </w:r>
+    </w:p>
+    <w:p>
+      <w:pPr>
+        <w:pStyle w:val="Normal"/>
+        <w:bidi w:val="0"/>
+        <w:jc w:val="left"/>
+        <w:rPr/>
+      </w:pPr>
+      <w:r>
+        <w:rPr/>
+      </w:r>
+    </w:p>
+    <w:p>
+      <w:pPr>
+        <w:pStyle w:val="Normal"/>
+        <w:bidi w:val="0"/>
+        <w:jc w:val="left"/>
+        <w:rPr>
+          <w:b/>
+          <w:b/>
+          <w:bCs/>
+          <w:sz w:val="36"/>
+          <w:szCs w:val="24"/>
+        </w:rPr>
+      </w:pPr>
+      <w:r>
+        <w:rPr>
+          <w:b/>
+          <w:bCs/>
+          <w:sz w:val="36"/>
+          <w:szCs w:val="24"/>
+        </w:rPr>
+        <w:t>UI Resz</w:t>
+      </w:r>
+    </w:p>
+    <w:p>
+      <w:pPr>
+        <w:pStyle w:val="Normal"/>
+        <w:bidi w:val="0"/>
+        <w:jc w:val="left"/>
+        <w:rPr/>
+      </w:pPr>
+      <w:r>
+        <w:rPr/>
+      </w:r>
+    </w:p>
+    <w:p>
+      <w:pPr>
+        <w:pStyle w:val="Normal"/>
+        <w:bidi w:val="0"/>
+        <w:jc w:val="left"/>
+        <w:rPr>
+          <w:b/>
+          <w:b/>
+          <w:bCs/>
+        </w:rPr>
+      </w:pPr>
+      <w:r>
+        <w:rPr>
+          <w:rFonts w:ascii="Arial;sans-serif" w:hAnsi="Arial;sans-serif"/>
+          <w:b/>
+          <w:bCs/>
+          <w:i w:val="false"/>
+          <w:caps w:val="false"/>
+          <w:smallCaps w:val="false"/>
+          <w:color w:val="222222"/>
+          <w:spacing w:val="0"/>
+          <w:sz w:val="19"/>
+        </w:rPr>
+        <w:t>Hanchett, Erik, and Ben Listwon. </w:t>
+      </w:r>
+      <w:r>
+        <w:rPr>
+          <w:rFonts w:ascii="Arial;sans-serif" w:hAnsi="Arial;sans-serif"/>
+          <w:b/>
+          <w:bCs/>
+          <w:i/>
+          <w:color w:val="222222"/>
+          <w:spacing w:val="0"/>
+          <w:sz w:val="19"/>
+        </w:rPr>
+        <w:t>Vue. js in Action</w:t>
+      </w:r>
+      <w:r>
+        <w:rPr>
+          <w:rFonts w:ascii="Arial;sans-serif" w:hAnsi="Arial;sans-serif"/>
+          <w:b/>
+          <w:bCs/>
+          <w:i w:val="false"/>
+          <w:caps w:val="false"/>
+          <w:smallCaps w:val="false"/>
+          <w:color w:val="222222"/>
+          <w:spacing w:val="0"/>
+          <w:sz w:val="19"/>
+        </w:rPr>
+        <w:t>. Simon and Schuster, 2018.</w:t>
+      </w:r>
+    </w:p>
+    <w:p>
+      <w:pPr>
+        <w:pStyle w:val="Normal"/>
+        <w:bidi w:val="0"/>
+        <w:jc w:val="left"/>
+        <w:rPr/>
+      </w:pPr>
       <w:hyperlink r:id="rId3">
         <w:r>
           <w:rPr>
             <w:rStyle w:val="InternetLink"/>
+            <w:rFonts w:ascii="Arial;sans-serif" w:hAnsi="Arial;sans-serif"/>
+            <w:b w:val="false"/>
+            <w:i w:val="false"/>
+            <w:caps w:val="false"/>
+            <w:smallCaps w:val="false"/>
+            <w:color w:val="222222"/>
+            <w:spacing w:val="0"/>
+            <w:sz w:val="19"/>
           </w:rPr>
-          <w:t>https://www.academia.edu/download/100125690/195413434.pdf</w:t>
+          <w:t>https://books.google.com/books?hl=hu&amp;lr=&amp;id=YzgzEAAAQBAJ&amp;oi=fnd&amp;pg=PT16&amp;dq=vue.js&amp;ots=RLNWZ0gH7q&amp;sig=dAY_BlCLWnsiGVK4qsQsmpkeKPM</w:t>
         </w:r>
       </w:hyperlink>
     </w:p>
@@ -649,232 +988,183 @@
         <w:bidi w:val="0"/>
         <w:jc w:val="left"/>
         <w:rPr>
-          <w:rStyle w:val="InternetLink"/>
-        </w:rPr>
-      </w:pPr>
-      <w:r>
-        <w:rPr/>
-      </w:r>
-    </w:p>
-    <w:p>
-      <w:pPr>
-        <w:pStyle w:val="Normal"/>
-        <w:bidi w:val="0"/>
-        <w:rPr/>
-      </w:pPr>
-      <w:r>
-        <w:rPr>
-          <w:rStyle w:val="InternetLink"/>
-          <w:b/>
-          <w:bCs/>
-          <w:color w:val="auto"/>
-          <w:u w:val="none"/>
-        </w:rPr>
-        <w:t xml:space="preserve">Nagy, S., &amp; Nagy, Z. (2021). Okos közlekedési fejlesztés a miskolci autóbusz menetrend példáján keresztül. </w:t>
-      </w:r>
-      <w:r>
-        <w:rPr>
-          <w:rStyle w:val="InternetLink"/>
+          <w:rFonts w:ascii="Arial;sans-serif" w:hAnsi="Arial;sans-serif"/>
+          <w:b w:val="false"/>
+          <w:i w:val="false"/>
+          <w:caps w:val="false"/>
+          <w:smallCaps w:val="false"/>
+          <w:color w:val="222222"/>
+          <w:spacing w:val="0"/>
+          <w:sz w:val="19"/>
+        </w:rPr>
+      </w:pPr>
+      <w:r>
+        <w:rPr/>
+      </w:r>
+    </w:p>
+    <w:p>
+      <w:pPr>
+        <w:pStyle w:val="Normal"/>
+        <w:bidi w:val="0"/>
+        <w:jc w:val="left"/>
+        <w:rPr>
+          <w:rFonts w:ascii="Arial;sans-serif" w:hAnsi="Arial;sans-serif"/>
+          <w:b w:val="false"/>
+          <w:i w:val="false"/>
+          <w:caps w:val="false"/>
+          <w:smallCaps w:val="false"/>
+          <w:color w:val="222222"/>
+          <w:spacing w:val="0"/>
+          <w:sz w:val="19"/>
+        </w:rPr>
+      </w:pPr>
+      <w:r>
+        <w:rPr/>
+      </w:r>
+    </w:p>
+    <w:p>
+      <w:pPr>
+        <w:pStyle w:val="Normal"/>
+        <w:bidi w:val="0"/>
+        <w:jc w:val="left"/>
+        <w:rPr>
+          <w:rFonts w:ascii="Arial;sans-serif" w:hAnsi="Arial;sans-serif"/>
+          <w:b w:val="false"/>
+          <w:i w:val="false"/>
+          <w:caps w:val="false"/>
+          <w:smallCaps w:val="false"/>
+          <w:color w:val="222222"/>
+          <w:spacing w:val="0"/>
+          <w:sz w:val="19"/>
+        </w:rPr>
+      </w:pPr>
+      <w:r>
+        <w:rPr>
+          <w:rFonts w:ascii="Arial;sans-serif" w:hAnsi="Arial;sans-serif"/>
+          <w:b/>
+          <w:bCs/>
+          <w:i w:val="false"/>
+          <w:caps w:val="false"/>
+          <w:smallCaps w:val="false"/>
+          <w:color w:val="222222"/>
+          <w:spacing w:val="0"/>
+          <w:sz w:val="19"/>
+        </w:rPr>
+        <w:t>Garaguso, Pablo David. </w:t>
+      </w:r>
+      <w:r>
+        <w:rPr>
+          <w:rFonts w:ascii="Arial;sans-serif" w:hAnsi="Arial;sans-serif"/>
           <w:b/>
           <w:bCs/>
           <w:i/>
-          <w:color w:val="auto"/>
-          <w:u w:val="none"/>
-        </w:rPr>
-        <w:t>ÉSZAK-MAGYARORSZÁGI STRATÉGIAI FÜZETEK</w:t>
-      </w:r>
-      <w:r>
-        <w:rPr>
-          <w:rStyle w:val="InternetLink"/>
-          <w:b/>
-          <w:bCs/>
-          <w:color w:val="auto"/>
-          <w:u w:val="none"/>
-        </w:rPr>
-        <w:t xml:space="preserve">, </w:t>
-      </w:r>
-      <w:r>
-        <w:rPr>
-          <w:rStyle w:val="InternetLink"/>
-          <w:b/>
-          <w:bCs/>
-          <w:i/>
-          <w:color w:val="auto"/>
-          <w:u w:val="none"/>
-        </w:rPr>
-        <w:t>18</w:t>
-      </w:r>
-      <w:r>
-        <w:rPr>
-          <w:rStyle w:val="InternetLink"/>
-          <w:b/>
-          <w:bCs/>
-          <w:color w:val="auto"/>
-          <w:u w:val="none"/>
-        </w:rPr>
-        <w:t>(Klnsz), 105-115.</w:t>
-      </w:r>
-    </w:p>
-    <w:p>
-      <w:pPr>
-        <w:pStyle w:val="Normal"/>
-        <w:bidi w:val="0"/>
-        <w:rPr/>
-      </w:pPr>
-      <w:hyperlink r:id="rId5">
+          <w:caps w:val="false"/>
+          <w:smallCaps w:val="false"/>
+          <w:color w:val="222222"/>
+          <w:spacing w:val="0"/>
+          <w:sz w:val="19"/>
+        </w:rPr>
+        <w:t>Vue. js 3 Design Patterns and Best Practices: Develop scalable and robust applications with Vite, Pinia, and Vue Router</w:t>
+      </w:r>
+      <w:r>
+        <w:rPr>
+          <w:rFonts w:ascii="Arial;sans-serif" w:hAnsi="Arial;sans-serif"/>
+          <w:b/>
+          <w:bCs/>
+          <w:i w:val="false"/>
+          <w:caps w:val="false"/>
+          <w:smallCaps w:val="false"/>
+          <w:color w:val="222222"/>
+          <w:spacing w:val="0"/>
+          <w:sz w:val="19"/>
+        </w:rPr>
+        <w:t>. Packt Publishing Ltd, 2023.</w:t>
+      </w:r>
+    </w:p>
+    <w:p>
+      <w:pPr>
+        <w:pStyle w:val="Normal"/>
+        <w:bidi w:val="0"/>
+        <w:jc w:val="left"/>
+        <w:rPr/>
+      </w:pPr>
+      <w:r>
+        <w:fldChar w:fldCharType="begin"/>
+      </w:r>
+      <w:r>
+        <w:rPr>
+          <w:rStyle w:val="InternetLink"/>
+          <w:smallCaps w:val="false"/>
+          <w:caps w:val="false"/>
+          <w:sz w:val="19"/>
+          <w:spacing w:val="0"/>
+          <w:i w:val="false"/>
+          <w:b w:val="false"/>
+          <w:rFonts w:ascii="Arial;sans-serif" w:hAnsi="Arial;sans-serif"/>
+          <w:color w:val="222222"/>
+        </w:rPr>
+        <w:instrText xml:space="preserve"> HYPERLINK "https://books.google.ro/books?id=v6W7EAAAQBAJ&amp;lpg=PP1&amp;ots=8O1wRQePNc&amp;dq=vue.js 3&amp;lr&amp;hl=hu&amp;pg=PP1" \l "v=onepage&amp;q=vue.js 3&amp;f=false"</w:instrText>
+      </w:r>
+      <w:r>
+        <w:rPr>
+          <w:rStyle w:val="InternetLink"/>
+          <w:smallCaps w:val="false"/>
+          <w:caps w:val="false"/>
+          <w:sz w:val="19"/>
+          <w:spacing w:val="0"/>
+          <w:i w:val="false"/>
+          <w:b w:val="false"/>
+          <w:rFonts w:ascii="Arial;sans-serif" w:hAnsi="Arial;sans-serif"/>
+          <w:color w:val="222222"/>
+        </w:rPr>
+        <w:fldChar w:fldCharType="separate"/>
+      </w:r>
+      <w:hyperlink r:id="rId4">
         <w:r>
           <w:rPr>
             <w:rStyle w:val="InternetLink"/>
-            <w:color w:val="000080"/>
-            <w:u w:val="single"/>
+            <w:rFonts w:ascii="Arial;sans-serif" w:hAnsi="Arial;sans-serif"/>
+            <w:b w:val="false"/>
+            <w:i w:val="false"/>
+            <w:caps w:val="false"/>
+            <w:smallCaps w:val="false"/>
+            <w:color w:val="222222"/>
+            <w:spacing w:val="0"/>
+            <w:sz w:val="19"/>
           </w:rPr>
-          <w:t>https://real.mtak.hu/125057/1/SF-2021-k_105_NagyStella_NagyZ.pdf</w:t>
+          <w:t>https://books.google.ro/books?id=v6W7EAAAQBAJ&amp;lpg=PP1&amp;ots=8O1wRQePNc&amp;dq=vue.js%203&amp;lr&amp;hl=hu&amp;pg=PP1#v=onepage&amp;q=vue.js%203&amp;f=false</w:t>
         </w:r>
       </w:hyperlink>
-    </w:p>
-    <w:p>
-      <w:pPr>
-        <w:pStyle w:val="Normal"/>
-        <w:bidi w:val="0"/>
-        <w:rPr>
-          <w:rStyle w:val="InternetLink"/>
-          <w:color w:val="auto"/>
-          <w:u w:val="none"/>
-        </w:rPr>
-      </w:pPr>
-      <w:r>
-        <w:rPr/>
-      </w:r>
-    </w:p>
-    <w:p>
-      <w:pPr>
-        <w:pStyle w:val="Normal"/>
-        <w:bidi w:val="0"/>
-        <w:rPr>
-          <w:rStyle w:val="InternetLink"/>
-          <w:color w:val="auto"/>
-          <w:u w:val="none"/>
-        </w:rPr>
-      </w:pPr>
-      <w:r>
-        <w:rPr/>
-      </w:r>
-    </w:p>
-    <w:p>
-      <w:pPr>
-        <w:pStyle w:val="Normal"/>
-        <w:bidi w:val="0"/>
-        <w:rPr/>
-      </w:pPr>
-      <w:r>
-        <w:rPr>
-          <w:rStyle w:val="InternetLink"/>
-          <w:b/>
-          <w:bCs/>
-          <w:color w:val="auto"/>
-          <w:u w:val="none"/>
-        </w:rPr>
-        <w:t>György, S. (2014). Konnektivitás a közösségi közlekedésben: Connected Bus.</w:t>
-      </w:r>
-    </w:p>
-    <w:p>
-      <w:pPr>
-        <w:pStyle w:val="Normal"/>
-        <w:bidi w:val="0"/>
-        <w:jc w:val="left"/>
-        <w:rPr/>
-      </w:pPr>
-      <w:hyperlink r:id="rId7">
-        <w:r>
-          <w:rPr>
-            <w:rStyle w:val="InternetLink"/>
-          </w:rPr>
-          <w:t>https://mmaws.bme.hu/2014/pages/program/papers/11.pdf</w:t>
-        </w:r>
-      </w:hyperlink>
-    </w:p>
-    <w:p>
-      <w:pPr>
-        <w:pStyle w:val="Normal"/>
-        <w:bidi w:val="0"/>
-        <w:jc w:val="left"/>
-        <w:rPr/>
-      </w:pPr>
-      <w:r>
-        <w:rPr/>
-      </w:r>
-    </w:p>
-    <w:p>
-      <w:pPr>
-        <w:pStyle w:val="Normal"/>
-        <w:bidi w:val="0"/>
-        <w:jc w:val="left"/>
-        <w:rPr>
-          <w:b/>
-          <w:b/>
-          <w:bCs/>
-        </w:rPr>
-      </w:pPr>
-      <w:r>
-        <w:rPr>
-          <w:b/>
-          <w:bCs/>
-        </w:rPr>
-        <w:t xml:space="preserve">Zungeru, A. M., Maidawa, K. D., Ambafi, J. G., &amp; Omokhafe, J. T. (2012). Design and Implementation of a Low Cost Digital Bus Passenger Counter. </w:t>
-      </w:r>
-      <w:r>
-        <w:rPr>
-          <w:b/>
-          <w:bCs/>
-          <w:i/>
-        </w:rPr>
-        <w:t>Innovative Systems Design and Engineering</w:t>
-      </w:r>
-      <w:r>
-        <w:rPr>
-          <w:b/>
-          <w:bCs/>
-        </w:rPr>
-        <w:t xml:space="preserve">, </w:t>
-      </w:r>
-      <w:r>
-        <w:rPr>
-          <w:b/>
-          <w:bCs/>
-          <w:i/>
-        </w:rPr>
-        <w:t>3</w:t>
-      </w:r>
-      <w:r>
-        <w:rPr>
-          <w:b/>
-          <w:bCs/>
-        </w:rPr>
-        <w:t>(4), 29-41.</w:t>
-      </w:r>
-    </w:p>
-    <w:p>
-      <w:pPr>
-        <w:pStyle w:val="Normal"/>
-        <w:bidi w:val="0"/>
-        <w:jc w:val="left"/>
-        <w:rPr/>
-      </w:pPr>
-      <w:hyperlink r:id="rId9">
-        <w:r>
-          <w:rPr>
-            <w:rStyle w:val="InternetLink"/>
-          </w:rPr>
-          <w:t>https://citeseerx.ist.psu.edu/document?repid=rep1&amp;type=pdf&amp;doi=cf3859762ef5c8f6850411a0d14f2e64e70a190f</w:t>
-        </w:r>
-      </w:hyperlink>
-    </w:p>
-    <w:p>
-      <w:pPr>
-        <w:pStyle w:val="Normal"/>
-        <w:bidi w:val="0"/>
-        <w:jc w:val="left"/>
-        <w:rPr/>
+      <w:r>
+        <w:rPr>
+          <w:rStyle w:val="InternetLink"/>
+          <w:smallCaps w:val="false"/>
+          <w:caps w:val="false"/>
+          <w:sz w:val="19"/>
+          <w:spacing w:val="0"/>
+          <w:i w:val="false"/>
+          <w:b w:val="false"/>
+          <w:rFonts w:ascii="Arial;sans-serif" w:hAnsi="Arial;sans-serif"/>
+          <w:color w:val="222222"/>
+        </w:rPr>
+        <w:fldChar w:fldCharType="end"/>
+      </w:r>
+    </w:p>
+    <w:p>
+      <w:pPr>
+        <w:pStyle w:val="Normal"/>
+        <w:bidi w:val="0"/>
+        <w:jc w:val="left"/>
+        <w:rPr>
+          <w:rFonts w:ascii="Arial;sans-serif" w:hAnsi="Arial;sans-serif"/>
+          <w:b w:val="false"/>
+          <w:i w:val="false"/>
+          <w:caps w:val="false"/>
+          <w:smallCaps w:val="false"/>
+          <w:color w:val="222222"/>
+          <w:spacing w:val="0"/>
+          <w:sz w:val="19"/>
+        </w:rPr>
       </w:pPr>
       <w:r>
         <w:rPr/>

</xml_diff>

<commit_message>
Extended Flutter docs + bibliography
</commit_message>
<xml_diff>
--- a/docs/collection/Szakirodalom.docx
+++ b/docs/collection/Szakirodalom.docx
@@ -965,7 +965,335 @@
         <w:jc w:val="left"/>
         <w:rPr/>
       </w:pPr>
-      <w:hyperlink r:id="rId3">
+      <w:r>
+        <w:rPr>
+          <w:rStyle w:val="InternetLink"/>
+          <w:rFonts w:ascii="Arial;sans-serif" w:hAnsi="Arial;sans-serif"/>
+          <w:b w:val="false"/>
+          <w:i w:val="false"/>
+          <w:caps w:val="false"/>
+          <w:smallCaps w:val="false"/>
+          <w:color w:val="222222"/>
+          <w:spacing w:val="0"/>
+          <w:sz w:val="19"/>
+        </w:rPr>
+        <w:t>https://books.google.com/books?hl=hu&amp;lr=&amp;id=YzgzEAAAQBAJ&amp;oi=fnd&amp;pg=PT16&amp;dq=vue.js&amp;ots=RLNWZ0gH7q&amp;sig=dAY_BlCLWnsiGVK4qsQsmpkeKPM</w:t>
+      </w:r>
+    </w:p>
+    <w:p>
+      <w:pPr>
+        <w:pStyle w:val="Normal"/>
+        <w:bidi w:val="0"/>
+        <w:jc w:val="left"/>
+        <w:rPr>
+          <w:rFonts w:ascii="Arial;sans-serif" w:hAnsi="Arial;sans-serif"/>
+          <w:b w:val="false"/>
+          <w:b w:val="false"/>
+          <w:i w:val="false"/>
+          <w:i w:val="false"/>
+          <w:caps w:val="false"/>
+          <w:smallCaps w:val="false"/>
+          <w:color w:val="222222"/>
+          <w:spacing w:val="0"/>
+          <w:sz w:val="19"/>
+        </w:rPr>
+      </w:pPr>
+      <w:r>
+        <w:rPr>
+          <w:rFonts w:ascii="Arial;sans-serif" w:hAnsi="Arial;sans-serif"/>
+          <w:b w:val="false"/>
+          <w:i w:val="false"/>
+          <w:caps w:val="false"/>
+          <w:smallCaps w:val="false"/>
+          <w:color w:val="222222"/>
+          <w:spacing w:val="0"/>
+          <w:sz w:val="19"/>
+        </w:rPr>
+      </w:r>
+    </w:p>
+    <w:p>
+      <w:pPr>
+        <w:pStyle w:val="Normal"/>
+        <w:bidi w:val="0"/>
+        <w:jc w:val="left"/>
+        <w:rPr>
+          <w:rFonts w:ascii="Arial;sans-serif" w:hAnsi="Arial;sans-serif"/>
+          <w:b w:val="false"/>
+          <w:b w:val="false"/>
+          <w:i w:val="false"/>
+          <w:i w:val="false"/>
+          <w:caps w:val="false"/>
+          <w:smallCaps w:val="false"/>
+          <w:color w:val="222222"/>
+          <w:spacing w:val="0"/>
+          <w:sz w:val="19"/>
+        </w:rPr>
+      </w:pPr>
+      <w:r>
+        <w:rPr>
+          <w:rFonts w:ascii="Arial;sans-serif" w:hAnsi="Arial;sans-serif"/>
+          <w:b w:val="false"/>
+          <w:i w:val="false"/>
+          <w:caps w:val="false"/>
+          <w:smallCaps w:val="false"/>
+          <w:color w:val="222222"/>
+          <w:spacing w:val="0"/>
+          <w:sz w:val="19"/>
+        </w:rPr>
+      </w:r>
+    </w:p>
+    <w:p>
+      <w:pPr>
+        <w:pStyle w:val="Normal"/>
+        <w:bidi w:val="0"/>
+        <w:jc w:val="left"/>
+        <w:rPr>
+          <w:rFonts w:ascii="Arial;sans-serif" w:hAnsi="Arial;sans-serif"/>
+          <w:b w:val="false"/>
+          <w:b w:val="false"/>
+          <w:i w:val="false"/>
+          <w:i w:val="false"/>
+          <w:caps w:val="false"/>
+          <w:smallCaps w:val="false"/>
+          <w:color w:val="222222"/>
+          <w:spacing w:val="0"/>
+          <w:sz w:val="19"/>
+        </w:rPr>
+      </w:pPr>
+      <w:r>
+        <w:rPr>
+          <w:rFonts w:ascii="Arial;sans-serif" w:hAnsi="Arial;sans-serif"/>
+          <w:b/>
+          <w:bCs/>
+          <w:i w:val="false"/>
+          <w:caps w:val="false"/>
+          <w:smallCaps w:val="false"/>
+          <w:color w:val="222222"/>
+          <w:spacing w:val="0"/>
+          <w:sz w:val="19"/>
+        </w:rPr>
+        <w:t>Garaguso, Pablo David. </w:t>
+      </w:r>
+      <w:r>
+        <w:rPr>
+          <w:rFonts w:ascii="Arial;sans-serif" w:hAnsi="Arial;sans-serif"/>
+          <w:b/>
+          <w:bCs/>
+          <w:i/>
+          <w:caps w:val="false"/>
+          <w:smallCaps w:val="false"/>
+          <w:color w:val="222222"/>
+          <w:spacing w:val="0"/>
+          <w:sz w:val="19"/>
+        </w:rPr>
+        <w:t>Vue. js 3 Design Patterns and Best Practices: Develop scalable and robust applications with Vite, Pinia, and Vue Router</w:t>
+      </w:r>
+      <w:r>
+        <w:rPr>
+          <w:rFonts w:ascii="Arial;sans-serif" w:hAnsi="Arial;sans-serif"/>
+          <w:b/>
+          <w:bCs/>
+          <w:i w:val="false"/>
+          <w:caps w:val="false"/>
+          <w:smallCaps w:val="false"/>
+          <w:color w:val="222222"/>
+          <w:spacing w:val="0"/>
+          <w:sz w:val="19"/>
+        </w:rPr>
+        <w:t>. Packt Publishing Ltd, 2023.</w:t>
+      </w:r>
+    </w:p>
+    <w:p>
+      <w:pPr>
+        <w:pStyle w:val="Normal"/>
+        <w:bidi w:val="0"/>
+        <w:jc w:val="left"/>
+        <w:rPr/>
+      </w:pPr>
+      <w:r>
+        <w:fldChar w:fldCharType="begin"/>
+      </w:r>
+      <w:r>
+        <w:rPr>
+          <w:rStyle w:val="InternetLink"/>
+          <w:smallCaps w:val="false"/>
+          <w:caps w:val="false"/>
+          <w:sz w:val="19"/>
+          <w:spacing w:val="0"/>
+          <w:i w:val="false"/>
+          <w:b w:val="false"/>
+          <w:rFonts w:ascii="Arial;sans-serif" w:hAnsi="Arial;sans-serif"/>
+          <w:color w:val="222222"/>
+        </w:rPr>
+        <w:instrText xml:space="preserve"> HYPERLINK "https://books.google.ro/books?id=v6W7EAAAQBAJ&amp;lpg=PP1&amp;ots=8O1wRQePNc&amp;dq=vue.js 3&amp;lr&amp;hl=hu&amp;pg=PP1" \l "v=onepage&amp;q=vue.js 3&amp;f=false"</w:instrText>
+      </w:r>
+      <w:r>
+        <w:rPr>
+          <w:rStyle w:val="InternetLink"/>
+          <w:smallCaps w:val="false"/>
+          <w:caps w:val="false"/>
+          <w:sz w:val="19"/>
+          <w:spacing w:val="0"/>
+          <w:i w:val="false"/>
+          <w:b w:val="false"/>
+          <w:rFonts w:ascii="Arial;sans-serif" w:hAnsi="Arial;sans-serif"/>
+          <w:color w:val="222222"/>
+        </w:rPr>
+        <w:fldChar w:fldCharType="separate"/>
+      </w:r>
+      <w:r>
+        <w:rPr>
+          <w:rStyle w:val="InternetLink"/>
+          <w:rFonts w:ascii="Arial;sans-serif" w:hAnsi="Arial;sans-serif"/>
+          <w:b w:val="false"/>
+          <w:i w:val="false"/>
+          <w:caps w:val="false"/>
+          <w:smallCaps w:val="false"/>
+          <w:color w:val="222222"/>
+          <w:spacing w:val="0"/>
+          <w:sz w:val="19"/>
+        </w:rPr>
+        <w:t>https://books.google.ro/books?id=v6W7EAAAQBAJ&amp;lpg=PP1&amp;ots=8O1wRQePNc&amp;dq=vue.js%203&amp;lr&amp;hl=hu&amp;pg=PP1#v=onepage&amp;q=vue.js%203&amp;f=false</w:t>
+      </w:r>
+      <w:r>
+        <w:rPr>
+          <w:rStyle w:val="InternetLink"/>
+          <w:smallCaps w:val="false"/>
+          <w:caps w:val="false"/>
+          <w:sz w:val="19"/>
+          <w:spacing w:val="0"/>
+          <w:i w:val="false"/>
+          <w:b w:val="false"/>
+          <w:rFonts w:ascii="Arial;sans-serif" w:hAnsi="Arial;sans-serif"/>
+          <w:color w:val="222222"/>
+        </w:rPr>
+        <w:fldChar w:fldCharType="end"/>
+      </w:r>
+    </w:p>
+    <w:p>
+      <w:pPr>
+        <w:pStyle w:val="Normal"/>
+        <w:bidi w:val="0"/>
+        <w:jc w:val="left"/>
+        <w:rPr>
+          <w:rFonts w:ascii="Arial;sans-serif" w:hAnsi="Arial;sans-serif"/>
+          <w:b w:val="false"/>
+          <w:b w:val="false"/>
+          <w:i w:val="false"/>
+          <w:i w:val="false"/>
+          <w:caps w:val="false"/>
+          <w:smallCaps w:val="false"/>
+          <w:color w:val="222222"/>
+          <w:spacing w:val="0"/>
+          <w:sz w:val="19"/>
+        </w:rPr>
+      </w:pPr>
+      <w:r>
+        <w:rPr/>
+      </w:r>
+    </w:p>
+    <w:p>
+      <w:pPr>
+        <w:pStyle w:val="Normal"/>
+        <w:bidi w:val="0"/>
+        <w:jc w:val="left"/>
+        <w:rPr>
+          <w:b/>
+          <w:b/>
+          <w:bCs/>
+        </w:rPr>
+      </w:pPr>
+      <w:r>
+        <w:rPr>
+          <w:rFonts w:ascii="Arial;sans-serif" w:hAnsi="Arial;sans-serif"/>
+          <w:b/>
+          <w:bCs/>
+          <w:i w:val="false"/>
+          <w:caps w:val="false"/>
+          <w:smallCaps w:val="false"/>
+          <w:color w:val="222222"/>
+          <w:spacing w:val="0"/>
+          <w:sz w:val="19"/>
+        </w:rPr>
+        <w:t>Windmill, Eric. </w:t>
+      </w:r>
+      <w:r>
+        <w:rPr>
+          <w:rFonts w:ascii="Arial;sans-serif" w:hAnsi="Arial;sans-serif"/>
+          <w:b/>
+          <w:bCs/>
+          <w:i/>
+          <w:color w:val="222222"/>
+          <w:spacing w:val="0"/>
+          <w:sz w:val="19"/>
+        </w:rPr>
+        <w:t>Flutter in action</w:t>
+      </w:r>
+      <w:r>
+        <w:rPr>
+          <w:rFonts w:ascii="Arial;sans-serif" w:hAnsi="Arial;sans-serif"/>
+          <w:b/>
+          <w:bCs/>
+          <w:i w:val="false"/>
+          <w:caps w:val="false"/>
+          <w:smallCaps w:val="false"/>
+          <w:color w:val="222222"/>
+          <w:spacing w:val="0"/>
+          <w:sz w:val="19"/>
+        </w:rPr>
+        <w:t>. Simon and Schuster, 2020.</w:t>
+      </w:r>
+    </w:p>
+    <w:p>
+      <w:pPr>
+        <w:pStyle w:val="Normal"/>
+        <w:bidi w:val="0"/>
+        <w:jc w:val="left"/>
+        <w:rPr>
+          <w:rFonts w:ascii="Arial;sans-serif" w:hAnsi="Arial;sans-serif"/>
+          <w:b w:val="false"/>
+          <w:b w:val="false"/>
+          <w:i w:val="false"/>
+          <w:i w:val="false"/>
+          <w:caps w:val="false"/>
+          <w:smallCaps w:val="false"/>
+          <w:color w:val="222222"/>
+          <w:spacing w:val="0"/>
+          <w:sz w:val="19"/>
+        </w:rPr>
+      </w:pPr>
+      <w:r>
+        <w:fldChar w:fldCharType="begin"/>
+      </w:r>
+      <w:r>
+        <w:rPr>
+          <w:rStyle w:val="InternetLink"/>
+          <w:smallCaps w:val="false"/>
+          <w:caps w:val="false"/>
+          <w:sz w:val="19"/>
+          <w:spacing w:val="0"/>
+          <w:i w:val="false"/>
+          <w:b w:val="false"/>
+          <w:rFonts w:ascii="Arial;sans-serif" w:hAnsi="Arial;sans-serif"/>
+          <w:color w:val="222222"/>
+        </w:rPr>
+        <w:instrText xml:space="preserve"> HYPERLINK "https://books.google.ro/books?hl=hu&amp;lr=&amp;id=EzgzEAAAQBAJ&amp;oi=fnd&amp;pg=PT19&amp;dq=flutter&amp;ots=7zqzE1aoD3&amp;sig=woJu0-vyn50rIspSYbUrV5ogEiM&amp;redir_esc=y" \l "v=onepage&amp;q=flutter&amp;f=false"</w:instrText>
+      </w:r>
+      <w:r>
+        <w:rPr>
+          <w:rStyle w:val="InternetLink"/>
+          <w:smallCaps w:val="false"/>
+          <w:caps w:val="false"/>
+          <w:sz w:val="19"/>
+          <w:spacing w:val="0"/>
+          <w:i w:val="false"/>
+          <w:b w:val="false"/>
+          <w:rFonts w:ascii="Arial;sans-serif" w:hAnsi="Arial;sans-serif"/>
+          <w:color w:val="222222"/>
+        </w:rPr>
+        <w:fldChar w:fldCharType="separate"/>
+      </w:r>
+      <w:hyperlink r:id="rId2">
         <w:r>
           <w:rPr>
             <w:rStyle w:val="InternetLink"/>
@@ -978,163 +1306,9 @@
             <w:spacing w:val="0"/>
             <w:sz w:val="19"/>
           </w:rPr>
-          <w:t>https://books.google.com/books?hl=hu&amp;lr=&amp;id=YzgzEAAAQBAJ&amp;oi=fnd&amp;pg=PT16&amp;dq=vue.js&amp;ots=RLNWZ0gH7q&amp;sig=dAY_BlCLWnsiGVK4qsQsmpkeKPM</w:t>
+          <w:t>https://books.google.ro/books?hl=hu&amp;lr=&amp;id=EzgzEAAAQBAJ&amp;oi=fnd&amp;pg=PT19&amp;dq=flutter&amp;ots=7zqzE1aoD3&amp;sig=woJu0-vyn50rIspSYbUrV5ogEiM&amp;redir_esc=y#v=onepage&amp;q=flutter&amp;f=false</w:t>
         </w:r>
       </w:hyperlink>
-    </w:p>
-    <w:p>
-      <w:pPr>
-        <w:pStyle w:val="Normal"/>
-        <w:bidi w:val="0"/>
-        <w:jc w:val="left"/>
-        <w:rPr>
-          <w:rFonts w:ascii="Arial;sans-serif" w:hAnsi="Arial;sans-serif"/>
-          <w:b w:val="false"/>
-          <w:i w:val="false"/>
-          <w:caps w:val="false"/>
-          <w:smallCaps w:val="false"/>
-          <w:color w:val="222222"/>
-          <w:spacing w:val="0"/>
-          <w:sz w:val="19"/>
-        </w:rPr>
-      </w:pPr>
-      <w:r>
-        <w:rPr/>
-      </w:r>
-    </w:p>
-    <w:p>
-      <w:pPr>
-        <w:pStyle w:val="Normal"/>
-        <w:bidi w:val="0"/>
-        <w:jc w:val="left"/>
-        <w:rPr>
-          <w:rFonts w:ascii="Arial;sans-serif" w:hAnsi="Arial;sans-serif"/>
-          <w:b w:val="false"/>
-          <w:i w:val="false"/>
-          <w:caps w:val="false"/>
-          <w:smallCaps w:val="false"/>
-          <w:color w:val="222222"/>
-          <w:spacing w:val="0"/>
-          <w:sz w:val="19"/>
-        </w:rPr>
-      </w:pPr>
-      <w:r>
-        <w:rPr/>
-      </w:r>
-    </w:p>
-    <w:p>
-      <w:pPr>
-        <w:pStyle w:val="Normal"/>
-        <w:bidi w:val="0"/>
-        <w:jc w:val="left"/>
-        <w:rPr>
-          <w:rFonts w:ascii="Arial;sans-serif" w:hAnsi="Arial;sans-serif"/>
-          <w:b w:val="false"/>
-          <w:i w:val="false"/>
-          <w:caps w:val="false"/>
-          <w:smallCaps w:val="false"/>
-          <w:color w:val="222222"/>
-          <w:spacing w:val="0"/>
-          <w:sz w:val="19"/>
-        </w:rPr>
-      </w:pPr>
-      <w:r>
-        <w:rPr>
-          <w:rFonts w:ascii="Arial;sans-serif" w:hAnsi="Arial;sans-serif"/>
-          <w:b/>
-          <w:bCs/>
-          <w:i w:val="false"/>
-          <w:caps w:val="false"/>
-          <w:smallCaps w:val="false"/>
-          <w:color w:val="222222"/>
-          <w:spacing w:val="0"/>
-          <w:sz w:val="19"/>
-        </w:rPr>
-        <w:t>Garaguso, Pablo David. </w:t>
-      </w:r>
-      <w:r>
-        <w:rPr>
-          <w:rFonts w:ascii="Arial;sans-serif" w:hAnsi="Arial;sans-serif"/>
-          <w:b/>
-          <w:bCs/>
-          <w:i/>
-          <w:caps w:val="false"/>
-          <w:smallCaps w:val="false"/>
-          <w:color w:val="222222"/>
-          <w:spacing w:val="0"/>
-          <w:sz w:val="19"/>
-        </w:rPr>
-        <w:t>Vue. js 3 Design Patterns and Best Practices: Develop scalable and robust applications with Vite, Pinia, and Vue Router</w:t>
-      </w:r>
-      <w:r>
-        <w:rPr>
-          <w:rFonts w:ascii="Arial;sans-serif" w:hAnsi="Arial;sans-serif"/>
-          <w:b/>
-          <w:bCs/>
-          <w:i w:val="false"/>
-          <w:caps w:val="false"/>
-          <w:smallCaps w:val="false"/>
-          <w:color w:val="222222"/>
-          <w:spacing w:val="0"/>
-          <w:sz w:val="19"/>
-        </w:rPr>
-        <w:t>. Packt Publishing Ltd, 2023.</w:t>
-      </w:r>
-    </w:p>
-    <w:p>
-      <w:pPr>
-        <w:pStyle w:val="Normal"/>
-        <w:bidi w:val="0"/>
-        <w:jc w:val="left"/>
-        <w:rPr/>
-      </w:pPr>
-      <w:r>
-        <w:fldChar w:fldCharType="begin"/>
-      </w:r>
-      <w:r>
-        <w:rPr>
-          <w:rStyle w:val="InternetLink"/>
-          <w:smallCaps w:val="false"/>
-          <w:caps w:val="false"/>
-          <w:sz w:val="19"/>
-          <w:spacing w:val="0"/>
-          <w:i w:val="false"/>
-          <w:b w:val="false"/>
-          <w:rFonts w:ascii="Arial;sans-serif" w:hAnsi="Arial;sans-serif"/>
-          <w:color w:val="222222"/>
-        </w:rPr>
-        <w:instrText xml:space="preserve"> HYPERLINK "https://books.google.ro/books?id=v6W7EAAAQBAJ&amp;lpg=PP1&amp;ots=8O1wRQePNc&amp;dq=vue.js 3&amp;lr&amp;hl=hu&amp;pg=PP1" \l "v=onepage&amp;q=vue.js 3&amp;f=false"</w:instrText>
-      </w:r>
-      <w:r>
-        <w:rPr>
-          <w:rStyle w:val="InternetLink"/>
-          <w:smallCaps w:val="false"/>
-          <w:caps w:val="false"/>
-          <w:sz w:val="19"/>
-          <w:spacing w:val="0"/>
-          <w:i w:val="false"/>
-          <w:b w:val="false"/>
-          <w:rFonts w:ascii="Arial;sans-serif" w:hAnsi="Arial;sans-serif"/>
-          <w:color w:val="222222"/>
-        </w:rPr>
-        <w:fldChar w:fldCharType="separate"/>
-      </w:r>
-      <w:hyperlink r:id="rId4">
-        <w:r>
-          <w:rPr>
-            <w:rStyle w:val="InternetLink"/>
-            <w:rFonts w:ascii="Arial;sans-serif" w:hAnsi="Arial;sans-serif"/>
-            <w:b w:val="false"/>
-            <w:i w:val="false"/>
-            <w:caps w:val="false"/>
-            <w:smallCaps w:val="false"/>
-            <w:color w:val="222222"/>
-            <w:spacing w:val="0"/>
-            <w:sz w:val="19"/>
-          </w:rPr>
-          <w:t>https://books.google.ro/books?id=v6W7EAAAQBAJ&amp;lpg=PP1&amp;ots=8O1wRQePNc&amp;dq=vue.js%203&amp;lr&amp;hl=hu&amp;pg=PP1#v=onepage&amp;q=vue.js%203&amp;f=false</w:t>
-        </w:r>
-      </w:hyperlink>
       <w:r>
         <w:rPr>
           <w:rStyle w:val="InternetLink"/>
@@ -1158,6 +1332,8 @@
         <w:rPr>
           <w:rFonts w:ascii="Arial;sans-serif" w:hAnsi="Arial;sans-serif"/>
           <w:b w:val="false"/>
+          <w:b w:val="false"/>
+          <w:i w:val="false"/>
           <w:i w:val="false"/>
           <w:caps w:val="false"/>
           <w:smallCaps w:val="false"/>

</xml_diff>

<commit_message>
Extended Admin website implementation
</commit_message>
<xml_diff>
--- a/docs/collection/Szakirodalom.docx
+++ b/docs/collection/Szakirodalom.docx
@@ -892,36 +892,443 @@
           <w:sz w:val="36"/>
           <w:szCs w:val="24"/>
         </w:rPr>
-        <w:t>UI Resz</w:t>
-      </w:r>
-    </w:p>
-    <w:p>
-      <w:pPr>
-        <w:pStyle w:val="Normal"/>
-        <w:bidi w:val="0"/>
-        <w:jc w:val="left"/>
-        <w:rPr/>
-      </w:pPr>
-      <w:r>
-        <w:rPr/>
-      </w:r>
-    </w:p>
-    <w:p>
-      <w:pPr>
-        <w:pStyle w:val="Normal"/>
-        <w:bidi w:val="0"/>
-        <w:jc w:val="left"/>
-        <w:rPr>
-          <w:b/>
-          <w:b/>
-          <w:bCs/>
-        </w:rPr>
-      </w:pPr>
-      <w:r>
-        <w:rPr>
-          <w:rFonts w:ascii="Arial;sans-serif" w:hAnsi="Arial;sans-serif"/>
-          <w:b/>
-          <w:bCs/>
+        <w:t>UI R</w:t>
+      </w:r>
+      <w:r>
+        <w:rPr>
+          <w:b/>
+          <w:bCs/>
+          <w:sz w:val="36"/>
+          <w:szCs w:val="24"/>
+        </w:rPr>
+        <w:t>é</w:t>
+      </w:r>
+      <w:r>
+        <w:rPr>
+          <w:b/>
+          <w:bCs/>
+          <w:sz w:val="36"/>
+          <w:szCs w:val="24"/>
+        </w:rPr>
+        <w:t>sz</w:t>
+      </w:r>
+    </w:p>
+    <w:p>
+      <w:pPr>
+        <w:pStyle w:val="Normal"/>
+        <w:bidi w:val="0"/>
+        <w:jc w:val="left"/>
+        <w:rPr/>
+      </w:pPr>
+      <w:r>
+        <w:rPr/>
+      </w:r>
+    </w:p>
+    <w:p>
+      <w:pPr>
+        <w:pStyle w:val="Normal"/>
+        <w:bidi w:val="0"/>
+        <w:jc w:val="left"/>
+        <w:rPr>
+          <w:sz w:val="20"/>
+          <w:szCs w:val="20"/>
+        </w:rPr>
+      </w:pPr>
+      <w:r>
+        <w:rPr>
+          <w:rFonts w:ascii="Arial;sans-serif" w:hAnsi="Arial;sans-serif"/>
+          <w:b/>
+          <w:bCs/>
+          <w:i w:val="false"/>
+          <w:caps w:val="false"/>
+          <w:smallCaps w:val="false"/>
+          <w:color w:val="222222"/>
+          <w:spacing w:val="0"/>
+          <w:sz w:val="20"/>
+          <w:szCs w:val="20"/>
+        </w:rPr>
+        <w:t>Hanchett, Erik, and Ben Listwon. </w:t>
+      </w:r>
+      <w:r>
+        <w:rPr>
+          <w:rFonts w:ascii="Arial;sans-serif" w:hAnsi="Arial;sans-serif"/>
+          <w:b/>
+          <w:bCs/>
+          <w:i/>
+          <w:color w:val="222222"/>
+          <w:spacing w:val="0"/>
+          <w:sz w:val="20"/>
+          <w:szCs w:val="20"/>
+        </w:rPr>
+        <w:t>Vue. js in Action</w:t>
+      </w:r>
+      <w:r>
+        <w:rPr>
+          <w:rFonts w:ascii="Arial;sans-serif" w:hAnsi="Arial;sans-serif"/>
+          <w:b/>
+          <w:bCs/>
+          <w:i w:val="false"/>
+          <w:caps w:val="false"/>
+          <w:smallCaps w:val="false"/>
+          <w:color w:val="222222"/>
+          <w:spacing w:val="0"/>
+          <w:sz w:val="20"/>
+          <w:szCs w:val="20"/>
+        </w:rPr>
+        <w:t>. Simon and Schuster, 2018.</w:t>
+      </w:r>
+    </w:p>
+    <w:p>
+      <w:pPr>
+        <w:pStyle w:val="Normal"/>
+        <w:bidi w:val="0"/>
+        <w:jc w:val="left"/>
+        <w:rPr/>
+      </w:pPr>
+      <w:r>
+        <w:rPr>
+          <w:rStyle w:val="InternetLink"/>
+          <w:rFonts w:ascii="Arial;sans-serif" w:hAnsi="Arial;sans-serif"/>
+          <w:b w:val="false"/>
+          <w:i w:val="false"/>
+          <w:caps w:val="false"/>
+          <w:smallCaps w:val="false"/>
+          <w:color w:val="222222"/>
+          <w:spacing w:val="0"/>
+          <w:sz w:val="20"/>
+          <w:szCs w:val="20"/>
+        </w:rPr>
+        <w:t>https://books.google.com/books?hl=hu&amp;lr=&amp;id=YzgzEAAAQBAJ&amp;oi=fnd&amp;pg=PT16&amp;dq=vue.js&amp;ots=RLNWZ0gH7q&amp;sig=dAY_BlCLWnsiGVK4qsQsmpkeKPM</w:t>
+      </w:r>
+    </w:p>
+    <w:p>
+      <w:pPr>
+        <w:pStyle w:val="Normal"/>
+        <w:bidi w:val="0"/>
+        <w:jc w:val="left"/>
+        <w:rPr>
+          <w:rFonts w:ascii="Arial;sans-serif" w:hAnsi="Arial;sans-serif"/>
+          <w:b w:val="false"/>
+          <w:b w:val="false"/>
+          <w:i w:val="false"/>
+          <w:i w:val="false"/>
+          <w:caps w:val="false"/>
+          <w:smallCaps w:val="false"/>
+          <w:color w:val="222222"/>
+          <w:spacing w:val="0"/>
+          <w:sz w:val="20"/>
+          <w:szCs w:val="20"/>
+        </w:rPr>
+      </w:pPr>
+      <w:r>
+        <w:rPr>
+          <w:rFonts w:ascii="Arial;sans-serif" w:hAnsi="Arial;sans-serif"/>
+          <w:b w:val="false"/>
+          <w:i w:val="false"/>
+          <w:caps w:val="false"/>
+          <w:smallCaps w:val="false"/>
+          <w:color w:val="222222"/>
+          <w:spacing w:val="0"/>
+          <w:sz w:val="20"/>
+          <w:szCs w:val="20"/>
+        </w:rPr>
+      </w:r>
+    </w:p>
+    <w:p>
+      <w:pPr>
+        <w:pStyle w:val="Normal"/>
+        <w:bidi w:val="0"/>
+        <w:jc w:val="left"/>
+        <w:rPr>
+          <w:sz w:val="20"/>
+          <w:szCs w:val="20"/>
+        </w:rPr>
+      </w:pPr>
+      <w:r>
+        <w:rPr>
+          <w:rFonts w:ascii="Arial;sans-serif" w:hAnsi="Arial;sans-serif"/>
+          <w:b/>
+          <w:bCs/>
+          <w:i w:val="false"/>
+          <w:caps w:val="false"/>
+          <w:smallCaps w:val="false"/>
+          <w:color w:val="222222"/>
+          <w:spacing w:val="0"/>
+          <w:sz w:val="20"/>
+          <w:szCs w:val="20"/>
+        </w:rPr>
+        <w:t>Garaguso, Pablo David. </w:t>
+      </w:r>
+      <w:r>
+        <w:rPr>
+          <w:rFonts w:ascii="Arial;sans-serif" w:hAnsi="Arial;sans-serif"/>
+          <w:b/>
+          <w:bCs/>
+          <w:i/>
+          <w:caps w:val="false"/>
+          <w:smallCaps w:val="false"/>
+          <w:color w:val="222222"/>
+          <w:spacing w:val="0"/>
+          <w:sz w:val="20"/>
+          <w:szCs w:val="20"/>
+        </w:rPr>
+        <w:t>Vue. js 3 Design Patterns and Best Practices: Develop scalable and robust applications with Vite, Pinia, and Vue Router</w:t>
+      </w:r>
+      <w:r>
+        <w:rPr>
+          <w:rFonts w:ascii="Arial;sans-serif" w:hAnsi="Arial;sans-serif"/>
+          <w:b/>
+          <w:bCs/>
+          <w:i w:val="false"/>
+          <w:caps w:val="false"/>
+          <w:smallCaps w:val="false"/>
+          <w:color w:val="222222"/>
+          <w:spacing w:val="0"/>
+          <w:sz w:val="20"/>
+          <w:szCs w:val="20"/>
+        </w:rPr>
+        <w:t>. Packt Publishing Ltd, 2023.</w:t>
+      </w:r>
+    </w:p>
+    <w:p>
+      <w:pPr>
+        <w:pStyle w:val="Normal"/>
+        <w:bidi w:val="0"/>
+        <w:jc w:val="left"/>
+        <w:rPr/>
+      </w:pPr>
+      <w:r>
+        <w:fldChar w:fldCharType="begin"/>
+      </w:r>
+      <w:r>
+        <w:rPr>
+          <w:rStyle w:val="InternetLink"/>
+          <w:smallCaps w:val="false"/>
+          <w:caps w:val="false"/>
+          <w:sz w:val="20"/>
+          <w:spacing w:val="0"/>
+          <w:i w:val="false"/>
+          <w:b w:val="false"/>
+          <w:szCs w:val="20"/>
+          <w:rFonts w:ascii="Arial;sans-serif" w:hAnsi="Arial;sans-serif"/>
+          <w:color w:val="222222"/>
+        </w:rPr>
+        <w:instrText xml:space="preserve"> HYPERLINK "https://books.google.ro/books?id=v6W7EAAAQBAJ&amp;lpg=PP1&amp;ots=8O1wRQePNc&amp;dq=vue.js 3&amp;lr&amp;hl=hu&amp;pg=PP1" \l "v=onepage&amp;q=vue.js 3&amp;f=false"</w:instrText>
+      </w:r>
+      <w:r>
+        <w:rPr>
+          <w:rStyle w:val="InternetLink"/>
+          <w:smallCaps w:val="false"/>
+          <w:caps w:val="false"/>
+          <w:sz w:val="20"/>
+          <w:spacing w:val="0"/>
+          <w:i w:val="false"/>
+          <w:b w:val="false"/>
+          <w:szCs w:val="20"/>
+          <w:rFonts w:ascii="Arial;sans-serif" w:hAnsi="Arial;sans-serif"/>
+          <w:color w:val="222222"/>
+        </w:rPr>
+        <w:fldChar w:fldCharType="separate"/>
+      </w:r>
+      <w:r>
+        <w:rPr>
+          <w:rStyle w:val="InternetLink"/>
+          <w:rFonts w:ascii="Arial;sans-serif" w:hAnsi="Arial;sans-serif"/>
+          <w:b w:val="false"/>
+          <w:i w:val="false"/>
+          <w:caps w:val="false"/>
+          <w:smallCaps w:val="false"/>
+          <w:color w:val="222222"/>
+          <w:spacing w:val="0"/>
+          <w:sz w:val="20"/>
+          <w:szCs w:val="20"/>
+        </w:rPr>
+        <w:t>https://books.google.ro/books?id=v6W7EAAAQBAJ&amp;lpg=PP1&amp;ots=8O1wRQePNc&amp;dq=vue.js%203&amp;lr&amp;hl=hu&amp;pg=PP1#v=onepage&amp;q=vue.js%203&amp;f=false</w:t>
+      </w:r>
+      <w:r>
+        <w:rPr>
+          <w:rStyle w:val="InternetLink"/>
+          <w:smallCaps w:val="false"/>
+          <w:caps w:val="false"/>
+          <w:sz w:val="20"/>
+          <w:spacing w:val="0"/>
+          <w:i w:val="false"/>
+          <w:b w:val="false"/>
+          <w:szCs w:val="20"/>
+          <w:rFonts w:ascii="Arial;sans-serif" w:hAnsi="Arial;sans-serif"/>
+          <w:color w:val="222222"/>
+        </w:rPr>
+        <w:fldChar w:fldCharType="end"/>
+      </w:r>
+    </w:p>
+    <w:p>
+      <w:pPr>
+        <w:pStyle w:val="Normal"/>
+        <w:bidi w:val="0"/>
+        <w:jc w:val="left"/>
+        <w:rPr>
+          <w:rFonts w:ascii="Arial;sans-serif" w:hAnsi="Arial;sans-serif"/>
+          <w:b w:val="false"/>
+          <w:b w:val="false"/>
+          <w:i w:val="false"/>
+          <w:i w:val="false"/>
+          <w:caps w:val="false"/>
+          <w:smallCaps w:val="false"/>
+          <w:color w:val="222222"/>
+          <w:spacing w:val="0"/>
+          <w:sz w:val="20"/>
+          <w:szCs w:val="20"/>
+        </w:rPr>
+      </w:pPr>
+      <w:r>
+        <w:rPr>
+          <w:rFonts w:ascii="Arial;sans-serif" w:hAnsi="Arial;sans-serif"/>
+          <w:b w:val="false"/>
+          <w:i w:val="false"/>
+          <w:caps w:val="false"/>
+          <w:smallCaps w:val="false"/>
+          <w:color w:val="222222"/>
+          <w:spacing w:val="0"/>
+          <w:sz w:val="20"/>
+          <w:szCs w:val="20"/>
+        </w:rPr>
+      </w:r>
+    </w:p>
+    <w:p>
+      <w:pPr>
+        <w:pStyle w:val="Normal"/>
+        <w:bidi w:val="0"/>
+        <w:jc w:val="left"/>
+        <w:rPr>
+          <w:sz w:val="20"/>
+          <w:szCs w:val="20"/>
+        </w:rPr>
+      </w:pPr>
+      <w:r>
+        <w:rPr>
+          <w:rFonts w:ascii="Arial;sans-serif" w:hAnsi="Arial;sans-serif"/>
+          <w:b/>
+          <w:bCs/>
+          <w:i w:val="false"/>
+          <w:caps w:val="false"/>
+          <w:smallCaps w:val="false"/>
+          <w:color w:val="222222"/>
+          <w:spacing w:val="0"/>
+          <w:sz w:val="20"/>
+          <w:szCs w:val="20"/>
+        </w:rPr>
+        <w:t>Windmill, Eric. </w:t>
+      </w:r>
+      <w:r>
+        <w:rPr>
+          <w:rFonts w:ascii="Arial;sans-serif" w:hAnsi="Arial;sans-serif"/>
+          <w:b/>
+          <w:bCs/>
+          <w:i/>
+          <w:color w:val="222222"/>
+          <w:spacing w:val="0"/>
+          <w:sz w:val="20"/>
+          <w:szCs w:val="20"/>
+        </w:rPr>
+        <w:t>Flutter in action</w:t>
+      </w:r>
+      <w:r>
+        <w:rPr>
+          <w:rFonts w:ascii="Arial;sans-serif" w:hAnsi="Arial;sans-serif"/>
+          <w:b/>
+          <w:bCs/>
+          <w:i w:val="false"/>
+          <w:caps w:val="false"/>
+          <w:smallCaps w:val="false"/>
+          <w:color w:val="222222"/>
+          <w:spacing w:val="0"/>
+          <w:sz w:val="20"/>
+          <w:szCs w:val="20"/>
+        </w:rPr>
+        <w:t>. Simon and Schuster, 2020.</w:t>
+      </w:r>
+    </w:p>
+    <w:p>
+      <w:pPr>
+        <w:pStyle w:val="Normal"/>
+        <w:bidi w:val="0"/>
+        <w:jc w:val="left"/>
+        <w:rPr/>
+      </w:pPr>
+      <w:r>
+        <w:fldChar w:fldCharType="begin"/>
+      </w:r>
+      <w:r>
+        <w:rPr>
+          <w:rStyle w:val="InternetLink"/>
+          <w:smallCaps w:val="false"/>
+          <w:caps w:val="false"/>
+          <w:sz w:val="20"/>
+          <w:spacing w:val="0"/>
+          <w:i w:val="false"/>
+          <w:b w:val="false"/>
+          <w:szCs w:val="20"/>
+          <w:rFonts w:ascii="Arial;sans-serif" w:hAnsi="Arial;sans-serif"/>
+          <w:color w:val="222222"/>
+        </w:rPr>
+        <w:instrText xml:space="preserve"> HYPERLINK "https://books.google.ro/books?hl=hu&amp;lr=&amp;id=EzgzEAAAQBAJ&amp;oi=fnd&amp;pg=PT19&amp;dq=flutter&amp;ots=7zqzE1aoD3&amp;sig=woJu0-vyn50rIspSYbUrV5ogEiM&amp;redir_esc=y" \l "v=onepage&amp;q=flutter&amp;f=false"</w:instrText>
+      </w:r>
+      <w:r>
+        <w:rPr>
+          <w:rStyle w:val="InternetLink"/>
+          <w:smallCaps w:val="false"/>
+          <w:caps w:val="false"/>
+          <w:sz w:val="20"/>
+          <w:spacing w:val="0"/>
+          <w:i w:val="false"/>
+          <w:b w:val="false"/>
+          <w:szCs w:val="20"/>
+          <w:rFonts w:ascii="Arial;sans-serif" w:hAnsi="Arial;sans-serif"/>
+          <w:color w:val="222222"/>
+        </w:rPr>
+        <w:fldChar w:fldCharType="separate"/>
+      </w:r>
+      <w:r>
+        <w:rPr>
+          <w:rStyle w:val="InternetLink"/>
+          <w:rFonts w:ascii="Arial;sans-serif" w:hAnsi="Arial;sans-serif"/>
+          <w:b w:val="false"/>
+          <w:i w:val="false"/>
+          <w:caps w:val="false"/>
+          <w:smallCaps w:val="false"/>
+          <w:color w:val="222222"/>
+          <w:spacing w:val="0"/>
+          <w:sz w:val="20"/>
+          <w:szCs w:val="20"/>
+        </w:rPr>
+        <w:t>https://books.google.ro/books?hl=hu&amp;lr=&amp;id=EzgzEAAAQBAJ&amp;oi=fnd&amp;pg=PT19&amp;dq=flutter&amp;ots=7zqzE1aoD3&amp;sig=woJu0-vyn50rIspSYbUrV5ogEiM&amp;redir_esc=y#v=onepage&amp;q=flutter&amp;f=false</w:t>
+      </w:r>
+      <w:r>
+        <w:rPr>
+          <w:rStyle w:val="InternetLink"/>
+          <w:smallCaps w:val="false"/>
+          <w:caps w:val="false"/>
+          <w:sz w:val="20"/>
+          <w:spacing w:val="0"/>
+          <w:i w:val="false"/>
+          <w:b w:val="false"/>
+          <w:szCs w:val="20"/>
+          <w:rFonts w:ascii="Arial;sans-serif" w:hAnsi="Arial;sans-serif"/>
+          <w:color w:val="222222"/>
+        </w:rPr>
+        <w:fldChar w:fldCharType="end"/>
+      </w:r>
+    </w:p>
+    <w:p>
+      <w:pPr>
+        <w:pStyle w:val="Normal"/>
+        <w:bidi w:val="0"/>
+        <w:jc w:val="left"/>
+        <w:rPr>
+          <w:rFonts w:ascii="Arial;sans-serif" w:hAnsi="Arial;sans-serif"/>
+          <w:b w:val="false"/>
+          <w:b w:val="false"/>
+          <w:i w:val="false"/>
           <w:i w:val="false"/>
           <w:caps w:val="false"/>
           <w:smallCaps w:val="false"/>
@@ -929,400 +1336,79 @@
           <w:spacing w:val="0"/>
           <w:sz w:val="19"/>
         </w:rPr>
-        <w:t>Hanchett, Erik, and Ben Listwon. </w:t>
-      </w:r>
-      <w:r>
-        <w:rPr>
-          <w:rFonts w:ascii="Arial;sans-serif" w:hAnsi="Arial;sans-serif"/>
+      </w:pPr>
+      <w:r>
+        <w:rPr/>
+      </w:r>
+    </w:p>
+    <w:p>
+      <w:pPr>
+        <w:pStyle w:val="Normal"/>
+        <w:bidi w:val="0"/>
+        <w:jc w:val="left"/>
+        <w:rPr>
+          <w:b/>
+          <w:b/>
+          <w:bCs/>
+          <w:sz w:val="20"/>
+          <w:szCs w:val="24"/>
+        </w:rPr>
+      </w:pPr>
+      <w:r>
+        <w:rPr>
+          <w:b/>
+          <w:bCs/>
+          <w:sz w:val="20"/>
+          <w:szCs w:val="24"/>
+        </w:rPr>
+        <w:t xml:space="preserve">Desai, Rashi. "Google Material Design–The User Interface Development Notion." </w:t>
+      </w:r>
+      <w:r>
+        <w:rPr>
           <w:b/>
           <w:bCs/>
           <w:i/>
+          <w:sz w:val="20"/>
+          <w:szCs w:val="24"/>
+        </w:rPr>
+        <w:t>IJSRD National Conference on Advances in Computer Science Engineering &amp; Technology</w:t>
+      </w:r>
+      <w:r>
+        <w:rPr>
+          <w:b/>
+          <w:bCs/>
+          <w:sz w:val="20"/>
+          <w:szCs w:val="24"/>
+        </w:rPr>
+        <w:t>. 2017.</w:t>
+      </w:r>
+    </w:p>
+    <w:p>
+      <w:pPr>
+        <w:pStyle w:val="Normal"/>
+        <w:bidi w:val="0"/>
+        <w:jc w:val="left"/>
+        <w:rPr>
+          <w:rFonts w:ascii="Arial;sans-serif" w:hAnsi="Arial;sans-serif"/>
+          <w:b w:val="false"/>
+          <w:b w:val="false"/>
+          <w:i w:val="false"/>
+          <w:i w:val="false"/>
+          <w:caps w:val="false"/>
+          <w:smallCaps w:val="false"/>
           <w:color w:val="222222"/>
           <w:spacing w:val="0"/>
           <w:sz w:val="19"/>
         </w:rPr>
-        <w:t>Vue. js in Action</w:t>
-      </w:r>
-      <w:r>
-        <w:rPr>
-          <w:rFonts w:ascii="Arial;sans-serif" w:hAnsi="Arial;sans-serif"/>
-          <w:b/>
-          <w:bCs/>
-          <w:i w:val="false"/>
-          <w:caps w:val="false"/>
-          <w:smallCaps w:val="false"/>
-          <w:color w:val="222222"/>
-          <w:spacing w:val="0"/>
-          <w:sz w:val="19"/>
-        </w:rPr>
-        <w:t>. Simon and Schuster, 2018.</w:t>
-      </w:r>
-    </w:p>
-    <w:p>
-      <w:pPr>
-        <w:pStyle w:val="Normal"/>
-        <w:bidi w:val="0"/>
-        <w:jc w:val="left"/>
-        <w:rPr/>
-      </w:pPr>
-      <w:r>
-        <w:rPr>
-          <w:rStyle w:val="InternetLink"/>
-          <w:rFonts w:ascii="Arial;sans-serif" w:hAnsi="Arial;sans-serif"/>
-          <w:b w:val="false"/>
-          <w:i w:val="false"/>
-          <w:caps w:val="false"/>
-          <w:smallCaps w:val="false"/>
-          <w:color w:val="222222"/>
-          <w:spacing w:val="0"/>
-          <w:sz w:val="19"/>
-        </w:rPr>
-        <w:t>https://books.google.com/books?hl=hu&amp;lr=&amp;id=YzgzEAAAQBAJ&amp;oi=fnd&amp;pg=PT16&amp;dq=vue.js&amp;ots=RLNWZ0gH7q&amp;sig=dAY_BlCLWnsiGVK4qsQsmpkeKPM</w:t>
-      </w:r>
-    </w:p>
-    <w:p>
-      <w:pPr>
-        <w:pStyle w:val="Normal"/>
-        <w:bidi w:val="0"/>
-        <w:jc w:val="left"/>
-        <w:rPr>
-          <w:rFonts w:ascii="Arial;sans-serif" w:hAnsi="Arial;sans-serif"/>
-          <w:b w:val="false"/>
-          <w:b w:val="false"/>
-          <w:i w:val="false"/>
-          <w:i w:val="false"/>
-          <w:caps w:val="false"/>
-          <w:smallCaps w:val="false"/>
-          <w:color w:val="222222"/>
-          <w:spacing w:val="0"/>
-          <w:sz w:val="19"/>
-        </w:rPr>
-      </w:pPr>
-      <w:r>
-        <w:rPr>
-          <w:rFonts w:ascii="Arial;sans-serif" w:hAnsi="Arial;sans-serif"/>
-          <w:b w:val="false"/>
-          <w:i w:val="false"/>
-          <w:caps w:val="false"/>
-          <w:smallCaps w:val="false"/>
-          <w:color w:val="222222"/>
-          <w:spacing w:val="0"/>
-          <w:sz w:val="19"/>
-        </w:rPr>
-      </w:r>
-    </w:p>
-    <w:p>
-      <w:pPr>
-        <w:pStyle w:val="Normal"/>
-        <w:bidi w:val="0"/>
-        <w:jc w:val="left"/>
-        <w:rPr>
-          <w:rFonts w:ascii="Arial;sans-serif" w:hAnsi="Arial;sans-serif"/>
-          <w:b w:val="false"/>
-          <w:b w:val="false"/>
-          <w:i w:val="false"/>
-          <w:i w:val="false"/>
-          <w:caps w:val="false"/>
-          <w:smallCaps w:val="false"/>
-          <w:color w:val="222222"/>
-          <w:spacing w:val="0"/>
-          <w:sz w:val="19"/>
-        </w:rPr>
-      </w:pPr>
-      <w:r>
-        <w:rPr>
-          <w:rFonts w:ascii="Arial;sans-serif" w:hAnsi="Arial;sans-serif"/>
-          <w:b w:val="false"/>
-          <w:i w:val="false"/>
-          <w:caps w:val="false"/>
-          <w:smallCaps w:val="false"/>
-          <w:color w:val="222222"/>
-          <w:spacing w:val="0"/>
-          <w:sz w:val="19"/>
-        </w:rPr>
-      </w:r>
-    </w:p>
-    <w:p>
-      <w:pPr>
-        <w:pStyle w:val="Normal"/>
-        <w:bidi w:val="0"/>
-        <w:jc w:val="left"/>
-        <w:rPr>
-          <w:rFonts w:ascii="Arial;sans-serif" w:hAnsi="Arial;sans-serif"/>
-          <w:b w:val="false"/>
-          <w:b w:val="false"/>
-          <w:i w:val="false"/>
-          <w:i w:val="false"/>
-          <w:caps w:val="false"/>
-          <w:smallCaps w:val="false"/>
-          <w:color w:val="222222"/>
-          <w:spacing w:val="0"/>
-          <w:sz w:val="19"/>
-        </w:rPr>
-      </w:pPr>
-      <w:r>
-        <w:rPr>
-          <w:rFonts w:ascii="Arial;sans-serif" w:hAnsi="Arial;sans-serif"/>
-          <w:b/>
-          <w:bCs/>
-          <w:i w:val="false"/>
-          <w:caps w:val="false"/>
-          <w:smallCaps w:val="false"/>
-          <w:color w:val="222222"/>
-          <w:spacing w:val="0"/>
-          <w:sz w:val="19"/>
-        </w:rPr>
-        <w:t>Garaguso, Pablo David. </w:t>
-      </w:r>
-      <w:r>
-        <w:rPr>
-          <w:rFonts w:ascii="Arial;sans-serif" w:hAnsi="Arial;sans-serif"/>
-          <w:b/>
-          <w:bCs/>
-          <w:i/>
-          <w:caps w:val="false"/>
-          <w:smallCaps w:val="false"/>
-          <w:color w:val="222222"/>
-          <w:spacing w:val="0"/>
-          <w:sz w:val="19"/>
-        </w:rPr>
-        <w:t>Vue. js 3 Design Patterns and Best Practices: Develop scalable and robust applications with Vite, Pinia, and Vue Router</w:t>
-      </w:r>
-      <w:r>
-        <w:rPr>
-          <w:rFonts w:ascii="Arial;sans-serif" w:hAnsi="Arial;sans-serif"/>
-          <w:b/>
-          <w:bCs/>
-          <w:i w:val="false"/>
-          <w:caps w:val="false"/>
-          <w:smallCaps w:val="false"/>
-          <w:color w:val="222222"/>
-          <w:spacing w:val="0"/>
-          <w:sz w:val="19"/>
-        </w:rPr>
-        <w:t>. Packt Publishing Ltd, 2023.</w:t>
-      </w:r>
-    </w:p>
-    <w:p>
-      <w:pPr>
-        <w:pStyle w:val="Normal"/>
-        <w:bidi w:val="0"/>
-        <w:jc w:val="left"/>
-        <w:rPr/>
-      </w:pPr>
-      <w:r>
-        <w:fldChar w:fldCharType="begin"/>
-      </w:r>
-      <w:r>
-        <w:rPr>
-          <w:rStyle w:val="InternetLink"/>
-          <w:smallCaps w:val="false"/>
-          <w:caps w:val="false"/>
-          <w:sz w:val="19"/>
-          <w:spacing w:val="0"/>
-          <w:i w:val="false"/>
-          <w:b w:val="false"/>
-          <w:rFonts w:ascii="Arial;sans-serif" w:hAnsi="Arial;sans-serif"/>
-          <w:color w:val="222222"/>
-        </w:rPr>
-        <w:instrText xml:space="preserve"> HYPERLINK "https://books.google.ro/books?id=v6W7EAAAQBAJ&amp;lpg=PP1&amp;ots=8O1wRQePNc&amp;dq=vue.js 3&amp;lr&amp;hl=hu&amp;pg=PP1" \l "v=onepage&amp;q=vue.js 3&amp;f=false"</w:instrText>
-      </w:r>
-      <w:r>
-        <w:rPr>
-          <w:rStyle w:val="InternetLink"/>
-          <w:smallCaps w:val="false"/>
-          <w:caps w:val="false"/>
-          <w:sz w:val="19"/>
-          <w:spacing w:val="0"/>
-          <w:i w:val="false"/>
-          <w:b w:val="false"/>
-          <w:rFonts w:ascii="Arial;sans-serif" w:hAnsi="Arial;sans-serif"/>
-          <w:color w:val="222222"/>
-        </w:rPr>
-        <w:fldChar w:fldCharType="separate"/>
-      </w:r>
-      <w:r>
-        <w:rPr>
-          <w:rStyle w:val="InternetLink"/>
-          <w:rFonts w:ascii="Arial;sans-serif" w:hAnsi="Arial;sans-serif"/>
-          <w:b w:val="false"/>
-          <w:i w:val="false"/>
-          <w:caps w:val="false"/>
-          <w:smallCaps w:val="false"/>
-          <w:color w:val="222222"/>
-          <w:spacing w:val="0"/>
-          <w:sz w:val="19"/>
-        </w:rPr>
-        <w:t>https://books.google.ro/books?id=v6W7EAAAQBAJ&amp;lpg=PP1&amp;ots=8O1wRQePNc&amp;dq=vue.js%203&amp;lr&amp;hl=hu&amp;pg=PP1#v=onepage&amp;q=vue.js%203&amp;f=false</w:t>
-      </w:r>
-      <w:r>
-        <w:rPr>
-          <w:rStyle w:val="InternetLink"/>
-          <w:smallCaps w:val="false"/>
-          <w:caps w:val="false"/>
-          <w:sz w:val="19"/>
-          <w:spacing w:val="0"/>
-          <w:i w:val="false"/>
-          <w:b w:val="false"/>
-          <w:rFonts w:ascii="Arial;sans-serif" w:hAnsi="Arial;sans-serif"/>
-          <w:color w:val="222222"/>
-        </w:rPr>
-        <w:fldChar w:fldCharType="end"/>
-      </w:r>
-    </w:p>
-    <w:p>
-      <w:pPr>
-        <w:pStyle w:val="Normal"/>
-        <w:bidi w:val="0"/>
-        <w:jc w:val="left"/>
-        <w:rPr>
-          <w:rFonts w:ascii="Arial;sans-serif" w:hAnsi="Arial;sans-serif"/>
-          <w:b w:val="false"/>
-          <w:b w:val="false"/>
-          <w:i w:val="false"/>
-          <w:i w:val="false"/>
-          <w:caps w:val="false"/>
-          <w:smallCaps w:val="false"/>
-          <w:color w:val="222222"/>
-          <w:spacing w:val="0"/>
-          <w:sz w:val="19"/>
-        </w:rPr>
-      </w:pPr>
-      <w:r>
-        <w:rPr/>
-      </w:r>
-    </w:p>
-    <w:p>
-      <w:pPr>
-        <w:pStyle w:val="Normal"/>
-        <w:bidi w:val="0"/>
-        <w:jc w:val="left"/>
-        <w:rPr>
-          <w:b/>
-          <w:b/>
-          <w:bCs/>
-        </w:rPr>
-      </w:pPr>
-      <w:r>
-        <w:rPr>
-          <w:rFonts w:ascii="Arial;sans-serif" w:hAnsi="Arial;sans-serif"/>
-          <w:b/>
-          <w:bCs/>
-          <w:i w:val="false"/>
-          <w:caps w:val="false"/>
-          <w:smallCaps w:val="false"/>
-          <w:color w:val="222222"/>
-          <w:spacing w:val="0"/>
-          <w:sz w:val="19"/>
-        </w:rPr>
-        <w:t>Windmill, Eric. </w:t>
-      </w:r>
-      <w:r>
-        <w:rPr>
-          <w:rFonts w:ascii="Arial;sans-serif" w:hAnsi="Arial;sans-serif"/>
-          <w:b/>
-          <w:bCs/>
-          <w:i/>
-          <w:color w:val="222222"/>
-          <w:spacing w:val="0"/>
-          <w:sz w:val="19"/>
-        </w:rPr>
-        <w:t>Flutter in action</w:t>
-      </w:r>
-      <w:r>
-        <w:rPr>
-          <w:rFonts w:ascii="Arial;sans-serif" w:hAnsi="Arial;sans-serif"/>
-          <w:b/>
-          <w:bCs/>
-          <w:i w:val="false"/>
-          <w:caps w:val="false"/>
-          <w:smallCaps w:val="false"/>
-          <w:color w:val="222222"/>
-          <w:spacing w:val="0"/>
-          <w:sz w:val="19"/>
-        </w:rPr>
-        <w:t>. Simon and Schuster, 2020.</w:t>
-      </w:r>
-    </w:p>
-    <w:p>
-      <w:pPr>
-        <w:pStyle w:val="Normal"/>
-        <w:bidi w:val="0"/>
-        <w:jc w:val="left"/>
-        <w:rPr>
-          <w:rFonts w:ascii="Arial;sans-serif" w:hAnsi="Arial;sans-serif"/>
-          <w:b w:val="false"/>
-          <w:b w:val="false"/>
-          <w:i w:val="false"/>
-          <w:i w:val="false"/>
-          <w:caps w:val="false"/>
-          <w:smallCaps w:val="false"/>
-          <w:color w:val="222222"/>
-          <w:spacing w:val="0"/>
-          <w:sz w:val="19"/>
-        </w:rPr>
-      </w:pPr>
-      <w:r>
-        <w:fldChar w:fldCharType="begin"/>
-      </w:r>
-      <w:r>
-        <w:rPr>
-          <w:rStyle w:val="InternetLink"/>
-          <w:smallCaps w:val="false"/>
-          <w:caps w:val="false"/>
-          <w:sz w:val="19"/>
-          <w:spacing w:val="0"/>
-          <w:i w:val="false"/>
-          <w:b w:val="false"/>
-          <w:rFonts w:ascii="Arial;sans-serif" w:hAnsi="Arial;sans-serif"/>
-          <w:color w:val="222222"/>
-        </w:rPr>
-        <w:instrText xml:space="preserve"> HYPERLINK "https://books.google.ro/books?hl=hu&amp;lr=&amp;id=EzgzEAAAQBAJ&amp;oi=fnd&amp;pg=PT19&amp;dq=flutter&amp;ots=7zqzE1aoD3&amp;sig=woJu0-vyn50rIspSYbUrV5ogEiM&amp;redir_esc=y" \l "v=onepage&amp;q=flutter&amp;f=false"</w:instrText>
-      </w:r>
-      <w:r>
-        <w:rPr>
-          <w:rStyle w:val="InternetLink"/>
-          <w:smallCaps w:val="false"/>
-          <w:caps w:val="false"/>
-          <w:sz w:val="19"/>
-          <w:spacing w:val="0"/>
-          <w:i w:val="false"/>
-          <w:b w:val="false"/>
-          <w:rFonts w:ascii="Arial;sans-serif" w:hAnsi="Arial;sans-serif"/>
-          <w:color w:val="222222"/>
-        </w:rPr>
-        <w:fldChar w:fldCharType="separate"/>
-      </w:r>
-      <w:hyperlink r:id="rId2">
+      </w:pPr>
+      <w:hyperlink r:id="rId3">
         <w:r>
           <w:rPr>
             <w:rStyle w:val="InternetLink"/>
-            <w:rFonts w:ascii="Arial;sans-serif" w:hAnsi="Arial;sans-serif"/>
-            <w:b w:val="false"/>
-            <w:i w:val="false"/>
-            <w:caps w:val="false"/>
-            <w:smallCaps w:val="false"/>
-            <w:color w:val="222222"/>
-            <w:spacing w:val="0"/>
-            <w:sz w:val="19"/>
           </w:rPr>
-          <w:t>https://books.google.ro/books?hl=hu&amp;lr=&amp;id=EzgzEAAAQBAJ&amp;oi=fnd&amp;pg=PT19&amp;dq=flutter&amp;ots=7zqzE1aoD3&amp;sig=woJu0-vyn50rIspSYbUrV5ogEiM&amp;redir_esc=y#v=onepage&amp;q=flutter&amp;f=false</w:t>
+          <w:t>https://www.academia.edu/download/79039925/NCACSETT4P047.pdf</w:t>
         </w:r>
       </w:hyperlink>
-      <w:r>
-        <w:rPr>
-          <w:rStyle w:val="InternetLink"/>
-          <w:smallCaps w:val="false"/>
-          <w:caps w:val="false"/>
-          <w:sz w:val="19"/>
-          <w:spacing w:val="0"/>
-          <w:i w:val="false"/>
-          <w:b w:val="false"/>
-          <w:rFonts w:ascii="Arial;sans-serif" w:hAnsi="Arial;sans-serif"/>
-          <w:color w:val="222222"/>
-        </w:rPr>
-        <w:fldChar w:fldCharType="end"/>
-      </w:r>
     </w:p>
     <w:p>
       <w:pPr>

</xml_diff>